<commit_message>
Actualizar informe: figuras corregidas y casos de uso CU21 y CU22
Co-Authored-By: Claude Sonnet 5.5 <noreply@anthropic.com>
Claude-Session: https://claude.ai/code/session_017nApkGXdonangYVQbXi6M2
</commit_message>
<xml_diff>
--- a/INFORME_EVENTOSIDETH_corregido.docx
+++ b/INFORME_EVENTOSIDETH_corregido.docx
@@ -7191,7 +7191,7 @@
                 <w:sz w:val="20"/>
                 <w:szCs w:val="20"/>
               </w:rPr>
-              <w:t xml:space="preserve">Incluido por: CU06 a CU12 y CU15 a CU20</w:t>
+              <w:t xml:space="preserve">Incluido por: CU06 a CU12 y CU15 a CU22</w:t>
             </w:r>
           </w:p>
         </w:tc>
@@ -10130,6 +10130,336 @@
                 <w:szCs w:val="20"/>
               </w:rPr>
               <w:t xml:space="preserve">Ver los reportes con su tipo y estado, y cambiarlo a en revisión o resuelto.</w:t>
+            </w:r>
+          </w:p>
+        </w:tc>
+        <w:tc>
+          <w:tcPr>
+            <w:tcW w:type="dxa" w:w="1900"/>
+            <w:tcBorders>
+              <w:top w:val="none" w:color="FFFFFF" w:sz="0"/>
+              <w:left w:val="none" w:color="FFFFFF" w:sz="0"/>
+              <w:bottom w:val="single" w:color="39A900" w:sz="12"/>
+              <w:right w:val="none" w:color="FFFFFF" w:sz="0"/>
+            </w:tcBorders>
+            <w:tcMar>
+              <w:top w:type="dxa" w:w="50"/>
+              <w:left w:type="dxa" w:w="100"/>
+              <w:bottom w:type="dxa" w:w="50"/>
+              <w:right w:type="dxa" w:w="100"/>
+            </w:tcMar>
+            <w:vAlign w:val="top"/>
+          </w:tcPr>
+          <w:p>
+            <w:pPr>
+              <w:spacing w:after="0" w:before="0" w:line="240" w:lineRule="auto"/>
+            </w:pPr>
+            <w:r>
+              <w:rPr>
+                <w:rFonts w:ascii="Times New Roman" w:cs="Times New Roman" w:eastAsia="Times New Roman" w:hAnsi="Times New Roman"/>
+                <w:color w:val="000000"/>
+                <w:sz w:val="20"/>
+                <w:szCs w:val="20"/>
+              </w:rPr>
+              <w:t xml:space="preserve">Incluye: Iniciar Sesión</w:t>
+            </w:r>
+          </w:p>
+        </w:tc>
+      </w:tr>
+      <w:tr>
+        <w:trPr>
+          <w:cantSplit/>
+        </w:trPr>
+        <w:tc>
+          <w:tcPr>
+            <w:tcW w:type="dxa" w:w="1000"/>
+            <w:tcBorders>
+              <w:top w:val="none" w:color="FFFFFF" w:sz="0"/>
+              <w:left w:val="none" w:color="FFFFFF" w:sz="0"/>
+              <w:bottom w:val="single" w:color="39A900" w:sz="12"/>
+              <w:right w:val="none" w:color="FFFFFF" w:sz="0"/>
+            </w:tcBorders>
+            <w:tcMar>
+              <w:top w:type="dxa" w:w="50"/>
+              <w:left w:type="dxa" w:w="100"/>
+              <w:bottom w:type="dxa" w:w="50"/>
+              <w:right w:type="dxa" w:w="100"/>
+            </w:tcMar>
+            <w:vAlign w:val="top"/>
+          </w:tcPr>
+          <w:p>
+            <w:pPr>
+              <w:spacing w:after="0" w:before="0" w:line="240" w:lineRule="auto"/>
+            </w:pPr>
+            <w:r>
+              <w:rPr>
+                <w:rFonts w:ascii="Times New Roman" w:cs="Times New Roman" w:eastAsia="Times New Roman" w:hAnsi="Times New Roman"/>
+                <w:color w:val="000000"/>
+                <w:sz w:val="20"/>
+                <w:szCs w:val="20"/>
+              </w:rPr>
+              <w:t xml:space="preserve">CU21</w:t>
+            </w:r>
+          </w:p>
+        </w:tc>
+        <w:tc>
+          <w:tcPr>
+            <w:tcW w:type="dxa" w:w="1800"/>
+            <w:tcBorders>
+              <w:top w:val="none" w:color="FFFFFF" w:sz="0"/>
+              <w:left w:val="none" w:color="FFFFFF" w:sz="0"/>
+              <w:bottom w:val="single" w:color="39A900" w:sz="12"/>
+              <w:right w:val="none" w:color="FFFFFF" w:sz="0"/>
+            </w:tcBorders>
+            <w:tcMar>
+              <w:top w:type="dxa" w:w="50"/>
+              <w:left w:type="dxa" w:w="100"/>
+              <w:bottom w:type="dxa" w:w="50"/>
+              <w:right w:type="dxa" w:w="100"/>
+            </w:tcMar>
+            <w:vAlign w:val="top"/>
+          </w:tcPr>
+          <w:p>
+            <w:pPr>
+              <w:spacing w:after="0" w:before="0" w:line="240" w:lineRule="auto"/>
+            </w:pPr>
+            <w:r>
+              <w:rPr>
+                <w:rFonts w:ascii="Times New Roman" w:cs="Times New Roman" w:eastAsia="Times New Roman" w:hAnsi="Times New Roman"/>
+                <w:color w:val="000000"/>
+                <w:sz w:val="20"/>
+                <w:szCs w:val="20"/>
+              </w:rPr>
+              <w:t xml:space="preserve">Gestionar Usuarios</w:t>
+            </w:r>
+          </w:p>
+        </w:tc>
+        <w:tc>
+          <w:tcPr>
+            <w:tcW w:type="dxa" w:w="1450"/>
+            <w:tcBorders>
+              <w:top w:val="none" w:color="FFFFFF" w:sz="0"/>
+              <w:left w:val="none" w:color="FFFFFF" w:sz="0"/>
+              <w:bottom w:val="single" w:color="39A900" w:sz="12"/>
+              <w:right w:val="none" w:color="FFFFFF" w:sz="0"/>
+            </w:tcBorders>
+            <w:tcMar>
+              <w:top w:type="dxa" w:w="50"/>
+              <w:left w:type="dxa" w:w="100"/>
+              <w:bottom w:type="dxa" w:w="50"/>
+              <w:right w:type="dxa" w:w="100"/>
+            </w:tcMar>
+            <w:vAlign w:val="top"/>
+          </w:tcPr>
+          <w:p>
+            <w:pPr>
+              <w:spacing w:after="0" w:before="0" w:line="240" w:lineRule="auto"/>
+            </w:pPr>
+            <w:r>
+              <w:rPr>
+                <w:rFonts w:ascii="Times New Roman" w:cs="Times New Roman" w:eastAsia="Times New Roman" w:hAnsi="Times New Roman"/>
+                <w:color w:val="000000"/>
+                <w:sz w:val="20"/>
+                <w:szCs w:val="20"/>
+              </w:rPr>
+              <w:t xml:space="preserve">Administrador</w:t>
+            </w:r>
+          </w:p>
+        </w:tc>
+        <w:tc>
+          <w:tcPr>
+            <w:tcW w:type="dxa" w:w="3210"/>
+            <w:tcBorders>
+              <w:top w:val="none" w:color="FFFFFF" w:sz="0"/>
+              <w:left w:val="none" w:color="FFFFFF" w:sz="0"/>
+              <w:bottom w:val="single" w:color="39A900" w:sz="12"/>
+              <w:right w:val="none" w:color="FFFFFF" w:sz="0"/>
+            </w:tcBorders>
+            <w:tcMar>
+              <w:top w:type="dxa" w:w="50"/>
+              <w:left w:type="dxa" w:w="100"/>
+              <w:bottom w:type="dxa" w:w="50"/>
+              <w:right w:type="dxa" w:w="100"/>
+            </w:tcMar>
+            <w:vAlign w:val="top"/>
+          </w:tcPr>
+          <w:p>
+            <w:pPr>
+              <w:spacing w:after="0" w:before="0" w:line="240" w:lineRule="auto"/>
+            </w:pPr>
+            <w:r>
+              <w:rPr>
+                <w:rFonts w:ascii="Times New Roman" w:cs="Times New Roman" w:eastAsia="Times New Roman" w:hAnsi="Times New Roman"/>
+                <w:color w:val="000000"/>
+                <w:sz w:val="20"/>
+                <w:szCs w:val="20"/>
+              </w:rPr>
+              <w:t xml:space="preserve">Ver los usuarios, cambiar su rol entre administrador y estudiante, y eliminarlos.</w:t>
+            </w:r>
+          </w:p>
+        </w:tc>
+        <w:tc>
+          <w:tcPr>
+            <w:tcW w:type="dxa" w:w="1900"/>
+            <w:tcBorders>
+              <w:top w:val="none" w:color="FFFFFF" w:sz="0"/>
+              <w:left w:val="none" w:color="FFFFFF" w:sz="0"/>
+              <w:bottom w:val="single" w:color="39A900" w:sz="12"/>
+              <w:right w:val="none" w:color="FFFFFF" w:sz="0"/>
+            </w:tcBorders>
+            <w:tcMar>
+              <w:top w:type="dxa" w:w="50"/>
+              <w:left w:type="dxa" w:w="100"/>
+              <w:bottom w:type="dxa" w:w="50"/>
+              <w:right w:type="dxa" w:w="100"/>
+            </w:tcMar>
+            <w:vAlign w:val="top"/>
+          </w:tcPr>
+          <w:p>
+            <w:pPr>
+              <w:spacing w:after="0" w:before="0" w:line="240" w:lineRule="auto"/>
+            </w:pPr>
+            <w:r>
+              <w:rPr>
+                <w:rFonts w:ascii="Times New Roman" w:cs="Times New Roman" w:eastAsia="Times New Roman" w:hAnsi="Times New Roman"/>
+                <w:color w:val="000000"/>
+                <w:sz w:val="20"/>
+                <w:szCs w:val="20"/>
+              </w:rPr>
+              <w:t xml:space="preserve">Incluye: Iniciar Sesión</w:t>
+            </w:r>
+          </w:p>
+        </w:tc>
+      </w:tr>
+      <w:tr>
+        <w:trPr>
+          <w:cantSplit/>
+        </w:trPr>
+        <w:tc>
+          <w:tcPr>
+            <w:tcW w:type="dxa" w:w="1000"/>
+            <w:tcBorders>
+              <w:top w:val="none" w:color="FFFFFF" w:sz="0"/>
+              <w:left w:val="none" w:color="FFFFFF" w:sz="0"/>
+              <w:bottom w:val="single" w:color="39A900" w:sz="12"/>
+              <w:right w:val="none" w:color="FFFFFF" w:sz="0"/>
+            </w:tcBorders>
+            <w:tcMar>
+              <w:top w:type="dxa" w:w="50"/>
+              <w:left w:type="dxa" w:w="100"/>
+              <w:bottom w:type="dxa" w:w="50"/>
+              <w:right w:type="dxa" w:w="100"/>
+            </w:tcMar>
+            <w:vAlign w:val="top"/>
+          </w:tcPr>
+          <w:p>
+            <w:pPr>
+              <w:spacing w:after="0" w:before="0" w:line="240" w:lineRule="auto"/>
+            </w:pPr>
+            <w:r>
+              <w:rPr>
+                <w:rFonts w:ascii="Times New Roman" w:cs="Times New Roman" w:eastAsia="Times New Roman" w:hAnsi="Times New Roman"/>
+                <w:color w:val="000000"/>
+                <w:sz w:val="20"/>
+                <w:szCs w:val="20"/>
+              </w:rPr>
+              <w:t xml:space="preserve">CU22</w:t>
+            </w:r>
+          </w:p>
+        </w:tc>
+        <w:tc>
+          <w:tcPr>
+            <w:tcW w:type="dxa" w:w="1800"/>
+            <w:tcBorders>
+              <w:top w:val="none" w:color="FFFFFF" w:sz="0"/>
+              <w:left w:val="none" w:color="FFFFFF" w:sz="0"/>
+              <w:bottom w:val="single" w:color="39A900" w:sz="12"/>
+              <w:right w:val="none" w:color="FFFFFF" w:sz="0"/>
+            </w:tcBorders>
+            <w:tcMar>
+              <w:top w:type="dxa" w:w="50"/>
+              <w:left w:type="dxa" w:w="100"/>
+              <w:bottom w:type="dxa" w:w="50"/>
+              <w:right w:type="dxa" w:w="100"/>
+            </w:tcMar>
+            <w:vAlign w:val="top"/>
+          </w:tcPr>
+          <w:p>
+            <w:pPr>
+              <w:spacing w:after="0" w:before="0" w:line="240" w:lineRule="auto"/>
+            </w:pPr>
+            <w:r>
+              <w:rPr>
+                <w:rFonts w:ascii="Times New Roman" w:cs="Times New Roman" w:eastAsia="Times New Roman" w:hAnsi="Times New Roman"/>
+                <w:color w:val="000000"/>
+                <w:sz w:val="20"/>
+                <w:szCs w:val="20"/>
+              </w:rPr>
+              <w:t xml:space="preserve">Consultar Inscritos</w:t>
+            </w:r>
+          </w:p>
+        </w:tc>
+        <w:tc>
+          <w:tcPr>
+            <w:tcW w:type="dxa" w:w="1450"/>
+            <w:tcBorders>
+              <w:top w:val="none" w:color="FFFFFF" w:sz="0"/>
+              <w:left w:val="none" w:color="FFFFFF" w:sz="0"/>
+              <w:bottom w:val="single" w:color="39A900" w:sz="12"/>
+              <w:right w:val="none" w:color="FFFFFF" w:sz="0"/>
+            </w:tcBorders>
+            <w:tcMar>
+              <w:top w:type="dxa" w:w="50"/>
+              <w:left w:type="dxa" w:w="100"/>
+              <w:bottom w:type="dxa" w:w="50"/>
+              <w:right w:type="dxa" w:w="100"/>
+            </w:tcMar>
+            <w:vAlign w:val="top"/>
+          </w:tcPr>
+          <w:p>
+            <w:pPr>
+              <w:spacing w:after="0" w:before="0" w:line="240" w:lineRule="auto"/>
+            </w:pPr>
+            <w:r>
+              <w:rPr>
+                <w:rFonts w:ascii="Times New Roman" w:cs="Times New Roman" w:eastAsia="Times New Roman" w:hAnsi="Times New Roman"/>
+                <w:color w:val="000000"/>
+                <w:sz w:val="20"/>
+                <w:szCs w:val="20"/>
+              </w:rPr>
+              <w:t xml:space="preserve">Administrador</w:t>
+            </w:r>
+          </w:p>
+        </w:tc>
+        <w:tc>
+          <w:tcPr>
+            <w:tcW w:type="dxa" w:w="3210"/>
+            <w:tcBorders>
+              <w:top w:val="none" w:color="FFFFFF" w:sz="0"/>
+              <w:left w:val="none" w:color="FFFFFF" w:sz="0"/>
+              <w:bottom w:val="single" w:color="39A900" w:sz="12"/>
+              <w:right w:val="none" w:color="FFFFFF" w:sz="0"/>
+            </w:tcBorders>
+            <w:tcMar>
+              <w:top w:type="dxa" w:w="50"/>
+              <w:left w:type="dxa" w:w="100"/>
+              <w:bottom w:type="dxa" w:w="50"/>
+              <w:right w:type="dxa" w:w="100"/>
+            </w:tcMar>
+            <w:vAlign w:val="top"/>
+          </w:tcPr>
+          <w:p>
+            <w:pPr>
+              <w:spacing w:after="0" w:before="0" w:line="240" w:lineRule="auto"/>
+            </w:pPr>
+            <w:r>
+              <w:rPr>
+                <w:rFonts w:ascii="Times New Roman" w:cs="Times New Roman" w:eastAsia="Times New Roman" w:hAnsi="Times New Roman"/>
+                <w:color w:val="000000"/>
+                <w:sz w:val="20"/>
+                <w:szCs w:val="20"/>
+              </w:rPr>
+              <w:t xml:space="preserve">Ver la lista de estudiantes inscritos en cada evento, con su rol y su propuesta o presentación.</w:t>
             </w:r>
           </w:p>
         </w:tc>
@@ -15317,7 +15647,7 @@
           <w:sz w:val="24"/>
           <w:szCs w:val="24"/>
         </w:rPr>
-        <w:t xml:space="preserve">El proyecto deja definidos su descripción y alcance, 23 requerimientos funcionales y 10 no funcionales, el diccionario de datos y el modelo entidad-relación de las 12 tablas, 20 casos de uso, los wireframes de las cinco páginas, siete módulos, el script de la base de datos y el mapa de navegación.</w:t>
+        <w:t xml:space="preserve">El proyecto deja definidos su descripción y alcance, 23 requerimientos funcionales y 10 no funcionales, el diccionario de datos y el modelo entidad-relación de las 12 tablas, 22 casos de uso, los wireframes de las cinco páginas, siete módulos, el script de la base de datos y el mapa de navegación.</w:t>
       </w:r>
     </w:p>
     <w:sectPr>

</xml_diff>